<commit_message>
ciclos , seleccion multiple funciones
</commit_message>
<xml_diff>
--- a/GUIAS/OPERADORES ARITMÉTICOS Y MÓDULO EN PHP 8.docx
+++ b/GUIAS/OPERADORES ARITMÉTICOS Y MÓDULO EN PHP 8.docx
@@ -130,37 +130,22 @@
     </w:p>
     <w:p>
       <w:r>
-        <w:t>$</w:t>
-      </w:r>
-      <w:proofErr w:type="spellStart"/>
-      <w:r>
-        <w:t>variable_negativa</w:t>
-      </w:r>
-      <w:proofErr w:type="spellEnd"/>
-      <w:r>
-        <w:t xml:space="preserve"> = -34;</w:t>
+        <w:t>$variable_negativa = -34;</w:t>
       </w:r>
     </w:p>
     <w:p/>
     <w:p>
       <w:r>
-        <w:t>echo $</w:t>
-      </w:r>
-      <w:proofErr w:type="spellStart"/>
-      <w:r>
-        <w:t>variable_negativa</w:t>
-      </w:r>
-      <w:proofErr w:type="spellEnd"/>
-      <w:r>
-        <w:t>;</w:t>
-      </w:r>
-    </w:p>
-    <w:p>
-      <w:r>
-        <w:rPr>
-          <w:b/>
-          <w:bCs/>
-        </w:rPr>
+        <w:t>echo $variable_negativa;</w:t>
+      </w:r>
+    </w:p>
+    <w:p>
+      <w:r>
+        <w:rPr>
+          <w:b/>
+          <w:bCs/>
+        </w:rPr>
+        <w:lastRenderedPageBreak/>
         <w:t>Resultado:</w:t>
       </w:r>
     </w:p>
@@ -171,15 +156,7 @@
     </w:p>
     <w:p>
       <w:r>
-        <w:t>En este ejemplo, la variable $</w:t>
-      </w:r>
-      <w:proofErr w:type="spellStart"/>
-      <w:r>
-        <w:t>variable_negativa</w:t>
-      </w:r>
-      <w:proofErr w:type="spellEnd"/>
-      <w:r>
-        <w:t xml:space="preserve"> almacena el número -34.</w:t>
+        <w:t>En este ejemplo, la variable $variable_negativa almacena el número -34.</w:t>
       </w:r>
     </w:p>
     <w:p>
@@ -758,6 +735,7 @@
     <w:p/>
     <w:p>
       <w:r>
+        <w:lastRenderedPageBreak/>
         <w:t>echo $c;</w:t>
       </w:r>
     </w:p>
@@ -1060,18 +1038,14 @@
     </w:p>
     <w:p>
       <w:r>
+        <w:lastRenderedPageBreak/>
         <w:t>$numero = 8;</w:t>
       </w:r>
     </w:p>
     <w:p/>
     <w:p>
-      <w:proofErr w:type="spellStart"/>
-      <w:r>
-        <w:t>if</w:t>
-      </w:r>
-      <w:proofErr w:type="spellEnd"/>
-      <w:r>
-        <w:t xml:space="preserve"> ($numero % 2 == 0) {</w:t>
+      <w:r>
+        <w:t>if ($numero % 2 == 0) {</w:t>
       </w:r>
     </w:p>
     <w:p>
@@ -1147,7 +1121,6 @@
         <w:t>$resultado = 2 + 3 * 4;</w:t>
       </w:r>
     </w:p>
-    <w:p/>
     <w:p>
       <w:r>
         <w:t>echo $resultado;</w:t>
@@ -1186,7 +1159,6 @@
         <w:t>$resultado = (2 + 3) * 4;</w:t>
       </w:r>
     </w:p>
-    <w:p/>
     <w:p>
       <w:r>
         <w:t>echo $resultado;</w:t>
@@ -1208,6 +1180,7 @@
     </w:p>
     <w:p>
       <w:r>
+        <w:lastRenderedPageBreak/>
         <w:t>En este caso, primero se suma 2 más 3 porque la operación está entre paréntesis. Después se multiplica el resultado por 4.</w:t>
       </w:r>
     </w:p>
@@ -1238,15 +1211,9 @@
     </w:p>
     <w:p>
       <w:r>
-        <w:t>&lt;?</w:t>
-      </w:r>
-      <w:proofErr w:type="spellStart"/>
-      <w:r>
-        <w:t>php</w:t>
-      </w:r>
-      <w:proofErr w:type="spellEnd"/>
-    </w:p>
-    <w:p/>
+        <w:t>&lt;?php</w:t>
+      </w:r>
+    </w:p>
     <w:p>
       <w:r>
         <w:t>$a = 2;</w:t>
@@ -1257,7 +1224,6 @@
         <w:t>$b = 5;</w:t>
       </w:r>
     </w:p>
-    <w:p/>
     <w:p>
       <w:r>
         <w:t>$suma = $a + $b;</w:t>
@@ -1270,28 +1236,12 @@
     </w:p>
     <w:p>
       <w:r>
-        <w:t>$</w:t>
-      </w:r>
-      <w:proofErr w:type="spellStart"/>
-      <w:r>
-        <w:t>multiplicacion</w:t>
-      </w:r>
-      <w:proofErr w:type="spellEnd"/>
-      <w:r>
-        <w:t xml:space="preserve"> = $a * $b;</w:t>
-      </w:r>
-    </w:p>
-    <w:p>
-      <w:r>
-        <w:t>$</w:t>
-      </w:r>
-      <w:proofErr w:type="spellStart"/>
-      <w:r>
-        <w:t>division</w:t>
-      </w:r>
-      <w:proofErr w:type="spellEnd"/>
-      <w:r>
-        <w:t xml:space="preserve"> = $a / $b;</w:t>
+        <w:t>$multiplicacion = $a * $b;</w:t>
+      </w:r>
+    </w:p>
+    <w:p>
+      <w:r>
+        <w:t>$division = $a / $b;</w:t>
       </w:r>
     </w:p>
     <w:p>
@@ -1299,147 +1249,31 @@
         <w:t>$modulo = $a % $b;</w:t>
       </w:r>
     </w:p>
-    <w:p/>
-    <w:p>
-      <w:r>
-        <w:t xml:space="preserve">echo "Suma: </w:t>
-      </w:r>
-      <w:proofErr w:type="gramStart"/>
-      <w:r>
-        <w:t>" .</w:t>
-      </w:r>
-      <w:proofErr w:type="gramEnd"/>
-      <w:r>
-        <w:t xml:space="preserve"> $</w:t>
-      </w:r>
-      <w:proofErr w:type="gramStart"/>
-      <w:r>
-        <w:t>suma .</w:t>
-      </w:r>
-      <w:proofErr w:type="gramEnd"/>
-      <w:r>
-        <w:t xml:space="preserve"> "&lt;</w:t>
-      </w:r>
-      <w:proofErr w:type="spellStart"/>
-      <w:r>
-        <w:t>br</w:t>
-      </w:r>
-      <w:proofErr w:type="spellEnd"/>
-      <w:r>
-        <w:t>&gt;";</w:t>
-      </w:r>
-    </w:p>
-    <w:p>
-      <w:r>
-        <w:t xml:space="preserve">echo "Resta: </w:t>
-      </w:r>
-      <w:proofErr w:type="gramStart"/>
-      <w:r>
-        <w:t>" .</w:t>
-      </w:r>
-      <w:proofErr w:type="gramEnd"/>
-      <w:r>
-        <w:t xml:space="preserve"> $</w:t>
-      </w:r>
-      <w:proofErr w:type="gramStart"/>
-      <w:r>
-        <w:t>resta .</w:t>
-      </w:r>
-      <w:proofErr w:type="gramEnd"/>
-      <w:r>
-        <w:t xml:space="preserve"> "&lt;</w:t>
-      </w:r>
-      <w:proofErr w:type="spellStart"/>
-      <w:r>
-        <w:t>br</w:t>
-      </w:r>
-      <w:proofErr w:type="spellEnd"/>
-      <w:r>
-        <w:t>&gt;";</w:t>
-      </w:r>
-    </w:p>
-    <w:p>
-      <w:r>
-        <w:t xml:space="preserve">echo "Multiplicación: </w:t>
-      </w:r>
-      <w:proofErr w:type="gramStart"/>
-      <w:r>
-        <w:t>" .</w:t>
-      </w:r>
-      <w:proofErr w:type="gramEnd"/>
-      <w:r>
-        <w:t xml:space="preserve"> $</w:t>
-      </w:r>
-      <w:proofErr w:type="spellStart"/>
-      <w:proofErr w:type="gramStart"/>
-      <w:r>
-        <w:t>multiplicacion</w:t>
-      </w:r>
-      <w:proofErr w:type="spellEnd"/>
-      <w:r>
-        <w:t xml:space="preserve"> .</w:t>
-      </w:r>
-      <w:proofErr w:type="gramEnd"/>
-      <w:r>
-        <w:t xml:space="preserve"> "&lt;</w:t>
-      </w:r>
-      <w:proofErr w:type="spellStart"/>
-      <w:r>
-        <w:t>br</w:t>
-      </w:r>
-      <w:proofErr w:type="spellEnd"/>
-      <w:r>
-        <w:t>&gt;";</w:t>
-      </w:r>
-    </w:p>
-    <w:p>
-      <w:r>
-        <w:t xml:space="preserve">echo "División: </w:t>
-      </w:r>
-      <w:proofErr w:type="gramStart"/>
-      <w:r>
-        <w:t>" .</w:t>
-      </w:r>
-      <w:proofErr w:type="gramEnd"/>
-      <w:r>
-        <w:t xml:space="preserve"> $</w:t>
-      </w:r>
-      <w:proofErr w:type="spellStart"/>
-      <w:proofErr w:type="gramStart"/>
-      <w:r>
-        <w:t>division</w:t>
-      </w:r>
-      <w:proofErr w:type="spellEnd"/>
-      <w:r>
-        <w:t xml:space="preserve"> .</w:t>
-      </w:r>
-      <w:proofErr w:type="gramEnd"/>
-      <w:r>
-        <w:t xml:space="preserve"> "&lt;</w:t>
-      </w:r>
-      <w:proofErr w:type="spellStart"/>
-      <w:r>
-        <w:t>br</w:t>
-      </w:r>
-      <w:proofErr w:type="spellEnd"/>
-      <w:r>
-        <w:t>&gt;";</w:t>
-      </w:r>
-    </w:p>
-    <w:p>
-      <w:r>
-        <w:t xml:space="preserve">echo "Módulo: </w:t>
-      </w:r>
-      <w:proofErr w:type="gramStart"/>
-      <w:r>
-        <w:t>" .</w:t>
-      </w:r>
-      <w:proofErr w:type="gramEnd"/>
-      <w:r>
-        <w:t xml:space="preserve"> $modulo;</w:t>
-      </w:r>
-    </w:p>
-    <w:p/>
+    <w:p>
+      <w:r>
+        <w:t>echo "Suma: " . $suma . "&lt;br&gt;";</w:t>
+      </w:r>
+    </w:p>
+    <w:p>
+      <w:r>
+        <w:t>echo "Resta: " . $resta . "&lt;br&gt;";</w:t>
+      </w:r>
+    </w:p>
+    <w:p>
+      <w:r>
+        <w:t>echo "Multiplicación: " . $multiplicacion . "&lt;br&gt;";</w:t>
+      </w:r>
+    </w:p>
+    <w:p>
+      <w:r>
+        <w:t>echo "División: " . $division . "&lt;br&gt;";</w:t>
+      </w:r>
+    </w:p>
+    <w:p>
+      <w:r>
+        <w:t>echo "Módulo: " . $modulo;</w:t>
+      </w:r>
+    </w:p>
     <w:p>
       <w:r>
         <w:t>?&gt;</w:t>
@@ -1481,28 +1315,13 @@
     </w:p>
     <w:p>
       <w:r>
+        <w:lastRenderedPageBreak/>
         <w:t>En este programa utilizamos las variables $a y $b para realizar las operaciones. Después guardamos cada resultado en una variable diferente y lo mostramos utilizando echo.</w:t>
       </w:r>
     </w:p>
     <w:p>
       <w:r>
-        <w:t xml:space="preserve">El </w:t>
-      </w:r>
-      <w:proofErr w:type="gramStart"/>
-      <w:r>
-        <w:t>operador .</w:t>
-      </w:r>
-      <w:proofErr w:type="gramEnd"/>
-      <w:r>
-        <w:t xml:space="preserve"> se utiliza para concatenar, es decir, unir un texto con el valor de una variable. Por otro lado, la etiqueta HTML &lt;</w:t>
-      </w:r>
-      <w:proofErr w:type="spellStart"/>
-      <w:r>
-        <w:t>br</w:t>
-      </w:r>
-      <w:proofErr w:type="spellEnd"/>
-      <w:r>
-        <w:t>&gt; permite mostrar cada resultado en una línea diferente cuando el código se ejecuta en una página web.</w:t>
+        <w:t>El operador . se utiliza para concatenar, es decir, unir un texto con el valor de una variable. Por otro lado, la etiqueta HTML &lt;br&gt; permite mostrar cada resultado en una línea diferente cuando el código se ejecuta en una página web.</w:t>
       </w:r>
     </w:p>
     <w:p>
@@ -2700,6 +2519,7 @@
   <w:style w:type="character" w:default="1" w:styleId="Fuentedeprrafopredeter">
     <w:name w:val="Default Paragraph Font"/>
     <w:uiPriority w:val="1"/>
+    <w:semiHidden/>
     <w:unhideWhenUsed/>
   </w:style>
   <w:style w:type="table" w:default="1" w:styleId="Tablanormal">

</xml_diff>